<commit_message>
Syllabus: reframe evaluation around expectations, not grade promises
- Remove the A-range guarantee, letter-range descriptions, and the
  "never handed down without a conversation" commitment; the final grade
  is the instructor's judgment, informed by the R3 self-evaluation
- Add "What meets expectations looks like" (attendance and preparation,
  deadlines, own writing, honest process)
- Late Work: firm deadlines for discussions and in-class prep; flexible
  with advance notice otherwise; self-granted extensions cap at Meets;
  one-week feedback window; absences/accommodations exempt
- Feedback turnaround is a goal, not a guarantee
- AI policy: note AI feedback on writing at the end of the piece
- Mirror all changes in the Fall 2026 .docx

Co-Authored-By: Claude Opus 5.5 <noreply@anthropic.com>
</commit_message>
<xml_diff>
--- a/WRIT20833_Fall_2026_Syllabus.docx
+++ b/WRIT20833_Fall_2026_Syllabus.docx
@@ -2833,23 +2833,23 @@
         <w:t xml:space="preserve">Grades</w:t>
       </w:r>
       <w:r>
-        <w:t xml:space="preserve">.</w:t>
-      </w:r>
-      <w:r>
-        <w:t xml:space="preserve"> </w:t>
-      </w:r>
-      <w:r>
-        <w:rPr>
-          <w:b/>
-          <w:bCs/>
-        </w:rPr>
-        <w:t xml:space="preserve">Expect a mark and written feedback within one week of each due date</w:t>
-      </w:r>
-      <w:r>
-        <w:t xml:space="preserve"> </w:t>
-      </w:r>
-      <w:r>
-        <w:t xml:space="preserve">(for discussions, one week after the Friday reply deadline). Work due on the final day is marked by the University's final-grade deadline.</w:t>
+        <w:t xml:space="preserve">. I aim to return marks and written feedback within about a week of each due date (see</w:t>
+      </w:r>
+      <w:r>
+        <w:t xml:space="preserve"> </w:t>
+      </w:r>
+      <w:r>
+        <w:rPr>
+          <w:i/>
+          <w:iCs/>
+        </w:rPr>
+        <w:t xml:space="preserve">Late Work</w:t>
+      </w:r>
+      <w:r>
+        <w:t xml:space="preserve"> </w:t>
+      </w:r>
+      <w:r>
+        <w:t xml:space="preserve">for the feedback window on late submissions).</w:t>
       </w:r>
     </w:p>
     <w:tbl>
@@ -4505,63 +4505,65 @@
         <w:t xml:space="preserve">where time allows.</w:t>
       </w:r>
     </w:p>
-    <w:bookmarkEnd w:id="25"/>
-    <w:bookmarkStart w:id="26" w:name="late-work"/>
     <w:p>
       <w:pPr>
-        <w:pStyle w:val="Heading3"/>
-      </w:pPr>
-      <w:r>
-        <w:t xml:space="preserve">Late Work</w:t>
+        <w:pStyle w:val="FirstParagraph"/>
+      </w:pPr>
+      <w:r>
+        <w:rPr>
+          <w:b/>
+          <w:bCs/>
+        </w:rPr>
+        <w:t xml:space="preserve">What "meets expectations" looks like.</w:t>
+      </w:r>
+      <w:r>
+        <w:t xml:space="preserve"> </w:t>
+      </w:r>
+      <w:r>
+        <w:t xml:space="preserve">Across the term, meeting expectations means:</w:t>
       </w:r>
     </w:p>
     <w:p>
       <w:pPr>
-        <w:pStyle w:val="FirstParagraph"/>
-      </w:pPr>
-      <w:r>
-        <w:t xml:space="preserve">Because sessions build on each other, keep up — but ungrading is about the whole</w:t>
-      </w:r>
-      <w:r>
-        <w:t xml:space="preserve"> </w:t>
-      </w:r>
-      <w:r>
-        <w:t xml:space="preserve">arc, not single due dates. If life happens,</w:t>
-      </w:r>
-      <w:r>
-        <w:t xml:space="preserve"> </w:t>
-      </w:r>
-      <w:r>
-        <w:rPr>
-          <w:b/>
-          <w:bCs/>
-        </w:rPr>
-        <w:t xml:space="preserve">talk to me</w:t>
-      </w:r>
-      <w:r>
-        <w:t xml:space="preserve">; honest communication beats a missed</w:t>
-      </w:r>
-      <w:r>
-        <w:t xml:space="preserve"> </w:t>
-      </w:r>
-      <w:r>
-        <w:t xml:space="preserve">deadline, and we'll find a reasonable way for you to complete the work.</w:t>
-      </w:r>
-      <w:r>
-        <w:t xml:space="preserve"> </w:t>
-      </w:r>
-      <w:r>
-        <w:rPr>
-          <w:b/>
-          <w:bCs/>
-        </w:rPr>
-        <w:t xml:space="preserve">Official University Absences</w:t>
-      </w:r>
-      <w:r>
-        <w:t xml:space="preserve"> </w:t>
-      </w:r>
-      <w:r>
-        <w:t xml:space="preserve">are always accommodated (see</w:t>
+        <w:pStyle w:val="Compact"/>
+        <w:numPr>
+          <w:ilvl w:val="0"/>
+          <w:numId w:val="1007"/>
+        </w:numPr>
+      </w:pPr>
+      <w:r>
+        <w:t xml:space="preserve">attending class regularly and</w:t>
+      </w:r>
+      <w:r>
+        <w:t xml:space="preserve"> </w:t>
+      </w:r>
+      <w:r>
+        <w:rPr>
+          <w:b/>
+          <w:bCs/>
+        </w:rPr>
+        <w:t xml:space="preserve">prepared</w:t>
+      </w:r>
+      <w:r>
+        <w:t xml:space="preserve">, meaning up to speed with the skills and concepts taught to</w:t>
+      </w:r>
+      <w:r>
+        <w:t xml:space="preserve"> </w:t>
+      </w:r>
+      <w:r>
+        <w:t xml:space="preserve">date, so you can take part in discussion and group activities;</w:t>
+      </w:r>
+    </w:p>
+    <w:p>
+      <w:pPr>
+        <w:pStyle w:val="Compact"/>
+        <w:numPr>
+          <w:ilvl w:val="0"/>
+          <w:numId w:val="1007"/>
+        </w:numPr>
+      </w:pPr>
+      <w:r>
+        <w:t xml:space="preserve">meeting firm deadlines, and arranging any extension on other work before it's due (see</w:t>
       </w:r>
       <w:r>
         <w:t xml:space="preserve"> </w:t>
@@ -4571,13 +4573,338 @@
           <w:i/>
           <w:iCs/>
         </w:rPr>
+        <w:t xml:space="preserve">Late Work</w:t>
+      </w:r>
+      <w:r>
+        <w:t xml:space="preserve">);</w:t>
+      </w:r>
+    </w:p>
+    <w:p>
+      <w:pPr>
+        <w:pStyle w:val="Compact"/>
+        <w:numPr>
+          <w:ilvl w:val="0"/>
+          <w:numId w:val="1007"/>
+        </w:numPr>
+      </w:pPr>
+      <w:r>
+        <w:t xml:space="preserve">writing your reflections, discussion posts, and</w:t>
+      </w:r>
+      <w:r>
+        <w:t xml:space="preserve"> </w:t>
+      </w:r>
+      <w:r>
+        <w:rPr>
+          <w:rStyle w:val="VerbatimChar"/>
+        </w:rPr>
+        <w:t xml:space="preserve">#comments</w:t>
+      </w:r>
+      <w:r>
+        <w:t xml:space="preserve"> </w:t>
+      </w:r>
+      <w:r>
+        <w:t xml:space="preserve">yourself; when properly documented, AI may</w:t>
+      </w:r>
+      <w:r>
+        <w:t xml:space="preserve"> </w:t>
+      </w:r>
+      <w:r>
+        <w:t xml:space="preserve">give feedback, but the words are yours (see</w:t>
+      </w:r>
+      <w:r>
+        <w:t xml:space="preserve"> </w:t>
+      </w:r>
+      <w:r>
+        <w:rPr>
+          <w:i/>
+          <w:iCs/>
+        </w:rPr>
+        <w:t xml:space="preserve">AI Use Policy</w:t>
+      </w:r>
+      <w:r>
+        <w:t xml:space="preserve">);</w:t>
+      </w:r>
+    </w:p>
+    <w:p>
+      <w:pPr>
+        <w:pStyle w:val="Compact"/>
+        <w:numPr>
+          <w:ilvl w:val="0"/>
+          <w:numId w:val="1007"/>
+        </w:numPr>
+      </w:pPr>
+      <w:r>
+        <w:t xml:space="preserve">documenting your process honestly, including what didn't work.</w:t>
+      </w:r>
+    </w:p>
+    <w:bookmarkEnd w:id="9000"/>
+    <w:bookmarkStart w:id="9001" w:name="late-work"/>
+    <w:p>
+      <w:pPr>
+        <w:pStyle w:val="Heading3"/>
+      </w:pPr>
+      <w:r>
+        <w:t xml:space="preserve">Late Work</w:t>
+      </w:r>
+    </w:p>
+    <w:p>
+      <w:pPr>
+        <w:pStyle w:val="FirstParagraph"/>
+      </w:pPr>
+      <w:r>
+        <w:t xml:space="preserve">Some deadlines are</w:t>
+      </w:r>
+      <w:r>
+        <w:t xml:space="preserve"> </w:t>
+      </w:r>
+      <w:r>
+        <w:rPr>
+          <w:b/>
+          <w:bCs/>
+        </w:rPr>
+        <w:t xml:space="preserve">firm</w:t>
+      </w:r>
+      <w:r>
+        <w:t xml:space="preserve"> </w:t>
+      </w:r>
+      <w:r>
+        <w:t xml:space="preserve">because classmates depend on them:</w:t>
+      </w:r>
+      <w:r>
+        <w:t xml:space="preserve"> </w:t>
+      </w:r>
+      <w:r>
+        <w:rPr>
+          <w:b/>
+          <w:bCs/>
+        </w:rPr>
+        <w:t xml:space="preserve">discussion posts and replies</w:t>
+      </w:r>
+      <w:r>
+        <w:t xml:space="preserve"> </w:t>
+      </w:r>
+      <w:r>
+        <w:t xml:space="preserve">(a</w:t>
+      </w:r>
+      <w:r>
+        <w:t xml:space="preserve"> </w:t>
+      </w:r>
+      <w:r>
+        <w:t xml:space="preserve">conversation only works while it's happening, so a post or reply made after its deadline can't be made</w:t>
+      </w:r>
+      <w:r>
+        <w:t xml:space="preserve"> </w:t>
+      </w:r>
+      <w:r>
+        <w:t xml:space="preserve">up, and that discussion stays at "not yet") and</w:t>
+      </w:r>
+      <w:r>
+        <w:t xml:space="preserve"> </w:t>
+      </w:r>
+      <w:r>
+        <w:rPr>
+          <w:b/>
+          <w:bCs/>
+        </w:rPr>
+        <w:t xml:space="preserve">preparation for in-class work sessions</w:t>
+      </w:r>
+      <w:r>
+        <w:t xml:space="preserve"> </w:t>
+      </w:r>
+      <w:r>
+        <w:t xml:space="preserve">(group work</w:t>
+      </w:r>
+      <w:r>
+        <w:t xml:space="preserve"> </w:t>
+      </w:r>
+      <w:r>
+        <w:t xml:space="preserve">needs everyone current). Other work, meaning homework notebooks, reflections, and revisions, is</w:t>
+      </w:r>
+      <w:r>
+        <w:t xml:space="preserve"> </w:t>
+      </w:r>
+      <w:r>
+        <w:rPr>
+          <w:b/>
+          <w:bCs/>
+        </w:rPr>
+        <w:t xml:space="preserve">flexible if you contact me before the due date</w:t>
+      </w:r>
+      <w:r>
+        <w:t xml:space="preserve">; we'll agree on a new date. Work that's late without</w:t>
+      </w:r>
+      <w:r>
+        <w:t xml:space="preserve"> </w:t>
+      </w:r>
+      <w:r>
+        <w:t xml:space="preserve">an arrangement stays at "not yet" until it's in. All work must be submitted by</w:t>
+      </w:r>
+      <w:r>
+        <w:t xml:space="preserve"> </w:t>
+      </w:r>
+      <w:r>
+        <w:rPr>
+          <w:b/>
+          <w:bCs/>
+        </w:rPr>
+        <w:t xml:space="preserve">Fri Dec 18</w:t>
+      </w:r>
+      <w:r>
+        <w:t xml:space="preserve">.</w:t>
+      </w:r>
+    </w:p>
+    <w:p>
+      <w:pPr>
+        <w:pStyle w:val="BodyText"/>
+      </w:pPr>
+      <w:r>
+        <w:rPr>
+          <w:b/>
+          <w:bCs/>
+        </w:rPr>
+        <w:t xml:space="preserve">Self-granted extensions.</w:t>
+      </w:r>
+      <w:r>
+        <w:t xml:space="preserve"> </w:t>
+      </w:r>
+      <w:r>
+        <w:t xml:space="preserve">Work submitted after the deadline without an arrangement made beforehand can</w:t>
+      </w:r>
+      <w:r>
+        <w:t xml:space="preserve"> </w:t>
+      </w:r>
+      <w:r>
+        <w:t xml:space="preserve">earn</w:t>
+      </w:r>
+      <w:r>
+        <w:t xml:space="preserve"> </w:t>
+      </w:r>
+      <w:r>
+        <w:rPr>
+          <w:b/>
+          <w:bCs/>
+        </w:rPr>
+        <w:t xml:space="preserve">Meets expectations</w:t>
+      </w:r>
+      <w:r>
+        <w:t xml:space="preserve"> </w:t>
+      </w:r>
+      <w:r>
+        <w:t xml:space="preserve">but not</w:t>
+      </w:r>
+      <w:r>
+        <w:t xml:space="preserve"> </w:t>
+      </w:r>
+      <w:r>
+        <w:rPr>
+          <w:b/>
+          <w:bCs/>
+        </w:rPr>
+        <w:t xml:space="preserve">Exceeds</w:t>
+      </w:r>
+      <w:r>
+        <w:t xml:space="preserve">; extra time you've given yourself is time your classmates</w:t>
+      </w:r>
+      <w:r>
+        <w:t xml:space="preserve"> </w:t>
+      </w:r>
+      <w:r>
+        <w:t xml:space="preserve">didn't have.</w:t>
+      </w:r>
+    </w:p>
+    <w:p>
+      <w:pPr>
+        <w:pStyle w:val="BodyText"/>
+      </w:pPr>
+      <w:r>
+        <w:rPr>
+          <w:b/>
+          <w:bCs/>
+        </w:rPr>
+        <w:t xml:space="preserve">Feedback window.</w:t>
+      </w:r>
+      <w:r>
+        <w:t xml:space="preserve"> </w:t>
+      </w:r>
+      <w:r>
+        <w:t xml:space="preserve">Feedback is most useful while we're still working with the material, so I give</w:t>
+      </w:r>
+      <w:r>
+        <w:t xml:space="preserve"> </w:t>
+      </w:r>
+      <w:r>
+        <w:t xml:space="preserve">written feedback on work submitted within one week of its due date. Work submitted later than that,</w:t>
+      </w:r>
+      <w:r>
+        <w:t xml:space="preserve"> </w:t>
+      </w:r>
+      <w:r>
+        <w:t xml:space="preserve">unless you've arranged it with me beforehand, still receives an Exceeds / Meets / Not yet mark and still</w:t>
+      </w:r>
+      <w:r>
+        <w:t xml:space="preserve"> </w:t>
+      </w:r>
+      <w:r>
+        <w:t xml:space="preserve">counts as part of your body of work, but it may come back without written comments.</w:t>
+      </w:r>
+    </w:p>
+    <w:p>
+      <w:pPr>
+        <w:pStyle w:val="BodyText"/>
+      </w:pPr>
+      <w:r>
+        <w:t xml:space="preserve">None of these limits apply to</w:t>
+      </w:r>
+      <w:r>
+        <w:t xml:space="preserve"> </w:t>
+      </w:r>
+      <w:r>
+        <w:rPr>
+          <w:b/>
+          <w:bCs/>
+        </w:rPr>
+        <w:t xml:space="preserve">Official University Absences</w:t>
+      </w:r>
+      <w:r>
+        <w:t xml:space="preserve"> </w:t>
+      </w:r>
+      <w:r>
+        <w:t xml:space="preserve">or</w:t>
+      </w:r>
+      <w:r>
+        <w:t xml:space="preserve"> </w:t>
+      </w:r>
+      <w:r>
+        <w:rPr>
+          <w:b/>
+          <w:bCs/>
+        </w:rPr>
+        <w:t xml:space="preserve">approved accommodations</w:t>
+      </w:r>
+      <w:r>
+        <w:t xml:space="preserve">; if one</w:t>
+      </w:r>
+      <w:r>
+        <w:t xml:space="preserve"> </w:t>
+      </w:r>
+      <w:r>
+        <w:t xml:space="preserve">affects a firm deadline, we'll arrange an alternative (see</w:t>
+      </w:r>
+      <w:r>
+        <w:t xml:space="preserve"> </w:t>
+      </w:r>
+      <w:r>
+        <w:rPr>
+          <w:i/>
+          <w:iCs/>
+        </w:rPr>
         <w:t xml:space="preserve">Attendance &amp; Engagement</w:t>
       </w:r>
       <w:r>
         <w:t xml:space="preserve">, next).</w:t>
       </w:r>
     </w:p>
-    <w:bookmarkEnd w:id="26"/>
+    <w:bookmarkEnd w:id="9001"/>
     <w:bookmarkStart w:id="27" w:name="attendance--engagement"/>
     <w:p>
       <w:pPr>
@@ -4778,28 +5105,19 @@
         <w:t xml:space="preserve">no point values</w:t>
       </w:r>
       <w:r>
-        <w:t xml:space="preserve"> </w:t>
-      </w:r>
-      <w:r>
-        <w:t xml:space="preserve">— the column a</w:t>
-      </w:r>
-      <w:r>
-        <w:t xml:space="preserve"> </w:t>
-      </w:r>
-      <w:r>
-        <w:t xml:space="preserve">conventional syllabus fills with points is replaced here by plain-language feedback marks, and the final</w:t>
-      </w:r>
-      <w:r>
-        <w:t xml:space="preserve"> </w:t>
-      </w:r>
-      <w:r>
-        <w:t xml:space="preserve">letter comes from what your body of work shows as a whole (below), not from a points total or a tally of</w:t>
-      </w:r>
-      <w:r>
-        <w:t xml:space="preserve"> </w:t>
-      </w:r>
-      <w:r>
-        <w:t xml:space="preserve">marks.</w:t>
+        <w:t xml:space="preserve">. In place of</w:t>
+      </w:r>
+      <w:r>
+        <w:t xml:space="preserve"> </w:t>
+      </w:r>
+      <w:r>
+        <w:t xml:space="preserve">points, each piece receives a plain-language feedback mark, and the final letter reflects your body of</w:t>
+      </w:r>
+      <w:r>
+        <w:t xml:space="preserve"> </w:t>
+      </w:r>
+      <w:r>
+        <w:t xml:space="preserve">work as a whole rather than a points total.</w:t>
       </w:r>
     </w:p>
     <w:tbl>
@@ -5363,7 +5681,7 @@
               <w:rPr>
                 <w:sz w:val="20"/>
               </w:rPr>
-              <w:t xml:space="preserve">R3 is where you propose your grade</w:t>
+              <w:t xml:space="preserve">R3 is your case for your grade</w:t>
             </w:r>
           </w:p>
         </w:tc>
@@ -5498,55 +5816,41 @@
         <w:pStyle w:val="BodyText"/>
       </w:pPr>
       <w:r>
-        <w:t xml:space="preserve">TCU requires a final letter grade. There is no formula behind it: I don't add up marks, and no number of</w:t>
-      </w:r>
-      <w:r>
-        <w:t xml:space="preserve"> </w:t>
-      </w:r>
-      <w:r>
-        <w:t xml:space="preserve">"Meets" or "Exceeds" marks converts into a letter. The marks on individual pieces are feedback along the way. The letter</w:t>
-      </w:r>
-      <w:r>
-        <w:t xml:space="preserve"> </w:t>
-      </w:r>
-      <w:r>
-        <w:t xml:space="preserve">answers one question about the term as a whole:</w:t>
-      </w:r>
-      <w:r>
-        <w:t xml:space="preserve"> </w:t>
-      </w:r>
-      <w:r>
-        <w:rPr>
-          <w:b/>
-          <w:bCs/>
-        </w:rPr>
-        <w:t xml:space="preserve">what does your body of work show about your</w:t>
-      </w:r>
-      <w:r>
-        <w:rPr>
-          <w:b/>
-          <w:bCs/>
-        </w:rPr>
-        <w:t xml:space="preserve"> </w:t>
-      </w:r>
-      <w:r>
-        <w:rPr>
-          <w:b/>
-          <w:bCs/>
-        </w:rPr>
-        <w:t xml:space="preserve">engagement and growth?</w:t>
-      </w:r>
-      <w:r>
-        <w:t xml:space="preserve"> </w:t>
-      </w:r>
-      <w:r>
-        <w:t xml:space="preserve">Your body of work is the four homeworks (with their Weekly Experiments), the</w:t>
-      </w:r>
-      <w:r>
-        <w:t xml:space="preserve"> </w:t>
-      </w:r>
-      <w:r>
-        <w:t xml:space="preserve">three reflections, the four discussions, and the capstone.</w:t>
+        <w:rPr>
+          <w:b/>
+          <w:bCs/>
+        </w:rPr>
+        <w:t xml:space="preserve">How the final grade is set.</w:t>
+      </w:r>
+      <w:r>
+        <w:t xml:space="preserve"> </w:t>
+      </w:r>
+      <w:r>
+        <w:t xml:space="preserve">TCU requires a final letter grade. It is not calculated from the marks</w:t>
+      </w:r>
+      <w:r>
+        <w:t xml:space="preserve"> </w:t>
+      </w:r>
+      <w:r>
+        <w:t xml:space="preserve">on individual pieces; those marks are feedback along the way. The letter reflects my overall judgment of</w:t>
+      </w:r>
+      <w:r>
+        <w:t xml:space="preserve"> </w:t>
+      </w:r>
+      <w:r>
+        <w:t xml:space="preserve">what your body of work shows about your engagement and growth across the term. Your body of work is the</w:t>
+      </w:r>
+      <w:r>
+        <w:t xml:space="preserve"> </w:t>
+      </w:r>
+      <w:r>
+        <w:t xml:space="preserve">four homeworks (with their Weekly Experiments), the four discussions, the three reflections, and the</w:t>
+      </w:r>
+      <w:r>
+        <w:t xml:space="preserve"> </w:t>
+      </w:r>
+      <w:r>
+        <w:t xml:space="preserve">capstone.</w:t>
       </w:r>
     </w:p>
     <w:p>
@@ -5558,31 +5862,25 @@
           <w:b/>
           <w:bCs/>
         </w:rPr>
-        <w:t xml:space="preserve">You propose your grade.</w:t>
-      </w:r>
-      <w:r>
-        <w:t xml:space="preserve"> </w:t>
-      </w:r>
-      <w:r>
-        <w:t xml:space="preserve">In Reflection 3 you look back across that body of work and make an</w:t>
-      </w:r>
-      <w:r>
-        <w:t xml:space="preserve"> </w:t>
-      </w:r>
-      <w:r>
-        <w:t xml:space="preserve">evidence-based case for the grade you've earned, pointing to specific pieces. I read your case alongside</w:t>
-      </w:r>
-      <w:r>
-        <w:t xml:space="preserve"> </w:t>
-      </w:r>
-      <w:r>
-        <w:t xml:space="preserve">the work. If I see it the same way, that's your grade. If I see it differently, we talk before grades are</w:t>
-      </w:r>
-      <w:r>
-        <w:t xml:space="preserve"> </w:t>
-      </w:r>
-      <w:r>
-        <w:t xml:space="preserve">submitted; a different letter is never handed down without that conversation.</w:t>
+        <w:t xml:space="preserve">Your self-evaluation.</w:t>
+      </w:r>
+      <w:r>
+        <w:t xml:space="preserve"> </w:t>
+      </w:r>
+      <w:r>
+        <w:t xml:space="preserve">In Reflection 3 you review that body of work and make an evidence-based case</w:t>
+      </w:r>
+      <w:r>
+        <w:t xml:space="preserve"> </w:t>
+      </w:r>
+      <w:r>
+        <w:t xml:space="preserve">for the grade you believe you've earned, pointing to specific pieces. I weigh your case alongside the</w:t>
+      </w:r>
+      <w:r>
+        <w:t xml:space="preserve"> </w:t>
+      </w:r>
+      <w:r>
+        <w:t xml:space="preserve">work itself when I assign the final grade.</w:t>
       </w:r>
     </w:p>
     <w:p>
@@ -5590,167 +5888,6 @@
         <w:pStyle w:val="BodyText"/>
       </w:pPr>
       <w:r>
-        <w:rPr>
-          <w:b/>
-          <w:bCs/>
-        </w:rPr>
-        <w:t xml:space="preserve">One thing is guaranteed.</w:t>
-      </w:r>
-      <w:r>
-        <w:t xml:space="preserve"> </w:t>
-      </w:r>
-      <w:r>
-        <w:t xml:space="preserve">If every piece is in and each one shows genuine engagement — nothing is</w:t>
-      </w:r>
-      <w:r>
-        <w:t xml:space="preserve"> </w:t>
-      </w:r>
-      <w:r>
-        <w:t xml:space="preserve">still at "not yet" — your grade is in the</w:t>
-      </w:r>
-      <w:r>
-        <w:t xml:space="preserve"> </w:t>
-      </w:r>
-      <w:r>
-        <w:rPr>
-          <w:b/>
-          <w:bCs/>
-        </w:rPr>
-        <w:t xml:space="preserve">A range</w:t>
-      </w:r>
-      <w:r>
-        <w:t xml:space="preserve">. You do not need to "exceed" anything to earn an A.</w:t>
-      </w:r>
-      <w:r>
-        <w:t xml:space="preserve"> </w:t>
-      </w:r>
-      <w:r>
-        <w:t xml:space="preserve">Whether it is an A or an A‑ is what your self-evaluation makes the case for.</w:t>
-      </w:r>
-    </w:p>
-    <w:p>
-      <w:pPr>
-        <w:pStyle w:val="BodyText"/>
-      </w:pPr>
-      <w:r>
-        <w:rPr>
-          <w:b/>
-          <w:bCs/>
-        </w:rPr>
-        <w:t xml:space="preserve">What each letter looks like.</w:t>
-      </w:r>
-      <w:r>
-        <w:t xml:space="preserve"> </w:t>
-      </w:r>
-      <w:r>
-        <w:t xml:space="preserve">These describe the body of work as a whole, not a count:</w:t>
-      </w:r>
-    </w:p>
-    <w:p>
-      <w:pPr>
-        <w:pStyle w:val="Compact"/>
-        <w:numPr>
-          <w:ilvl w:val="0"/>
-          <w:numId w:val="1008"/>
-        </w:numPr>
-      </w:pPr>
-      <w:r>
-        <w:rPr>
-          <w:b/>
-          <w:bCs/>
-        </w:rPr>
-        <w:t xml:space="preserve">A range:</w:t>
-      </w:r>
-      <w:r>
-        <w:t xml:space="preserve"> </w:t>
-      </w:r>
-      <w:r>
-        <w:t xml:space="preserve">All the work is done with honest engagement. Your notebooks and reflections show your</w:t>
-      </w:r>
-      <w:r>
-        <w:t xml:space="preserve"> </w:t>
-      </w:r>
-      <w:r>
-        <w:t xml:space="preserve">thinking, including what didn't work. Your capstone argues from your data and names its limits.</w:t>
-      </w:r>
-    </w:p>
-    <w:p>
-      <w:pPr>
-        <w:pStyle w:val="Compact"/>
-        <w:numPr>
-          <w:ilvl w:val="0"/>
-          <w:numId w:val="1008"/>
-        </w:numPr>
-      </w:pPr>
-      <w:r>
-        <w:rPr>
-          <w:b/>
-          <w:bCs/>
-        </w:rPr>
-        <w:t xml:space="preserve">B range:</w:t>
-      </w:r>
-      <w:r>
-        <w:t xml:space="preserve"> </w:t>
-      </w:r>
-      <w:r>
-        <w:t xml:space="preserve">Real engagement, with real gaps. Some work is missing or thin and wasn't returned to, or</w:t>
-      </w:r>
-      <w:r>
-        <w:t xml:space="preserve"> </w:t>
-      </w:r>
-      <w:r>
-        <w:t xml:space="preserve">the capstone's argument or its account of its limits is underdeveloped.</w:t>
-      </w:r>
-    </w:p>
-    <w:p>
-      <w:pPr>
-        <w:pStyle w:val="Compact"/>
-        <w:numPr>
-          <w:ilvl w:val="0"/>
-          <w:numId w:val="1008"/>
-        </w:numPr>
-      </w:pPr>
-      <w:r>
-        <w:rPr>
-          <w:b/>
-          <w:bCs/>
-        </w:rPr>
-        <w:t xml:space="preserve">C range:</w:t>
-      </w:r>
-      <w:r>
-        <w:t xml:space="preserve"> </w:t>
-      </w:r>
-      <w:r>
-        <w:t xml:space="preserve">Substantial portions of the work are missing or minimal, but the capstone is complete.</w:t>
-      </w:r>
-    </w:p>
-    <w:p>
-      <w:pPr>
-        <w:pStyle w:val="Compact"/>
-        <w:numPr>
-          <w:ilvl w:val="0"/>
-          <w:numId w:val="1008"/>
-        </w:numPr>
-      </w:pPr>
-      <w:r>
-        <w:rPr>
-          <w:b/>
-          <w:bCs/>
-        </w:rPr>
-        <w:t xml:space="preserve">D / F:</w:t>
-      </w:r>
-      <w:r>
-        <w:t xml:space="preserve"> </w:t>
-      </w:r>
-      <w:r>
-        <w:t xml:space="preserve">Most of the work is missing, or there is no capstone.</w:t>
-      </w:r>
-    </w:p>
-    <w:p>
-      <w:pPr>
-        <w:pStyle w:val="FirstParagraph"/>
-      </w:pPr>
-      <w:r>
         <w:t xml:space="preserve">"Engaged" means real effort and honest documentation of your process —</w:t>
       </w:r>
       <w:r>
@@ -5784,12 +5921,6 @@
           <w:bCs/>
         </w:rPr>
         <w:t xml:space="preserve">meets expectations.</w:t>
-      </w:r>
-      <w:r>
-        <w:t xml:space="preserve"> </w:t>
-      </w:r>
-      <w:r>
-        <w:t xml:space="preserve">A piece marked "not yet" can be revised while time allows, and the revision is what counts.</w:t>
       </w:r>
     </w:p>
     <w:bookmarkEnd w:id="28"/>
@@ -5851,13 +5982,13 @@
         <w:t xml:space="preserve"> </w:t>
       </w:r>
       <w:r>
-        <w:t xml:space="preserve">Because the course is ungraded, there's nothing to "dispute" point-by-point — but my</w:t>
-      </w:r>
-      <w:r>
-        <w:t xml:space="preserve"> </w:t>
-      </w:r>
-      <w:r>
-        <w:t xml:space="preserve">feedback is always open to conversation. If a comment doesn't sit right, email me at</w:t>
+        <w:t xml:space="preserve">My feedback is always open to conversation. If a mark or comment doesn't sit right,</w:t>
+      </w:r>
+      <w:r>
+        <w:t xml:space="preserve"> </w:t>
+      </w:r>
+      <w:r>
+        <w:t xml:space="preserve">email me at</w:t>
       </w:r>
       <w:r>
         <w:t xml:space="preserve"> </w:t>
@@ -5874,41 +6005,43 @@
         <w:t xml:space="preserve"> </w:t>
       </w:r>
       <w:r>
-        <w:t xml:space="preserve">and we'll talk it through: since each piece is evaluated on engagement and reflection rather than a</w:t>
-      </w:r>
-      <w:r>
-        <w:t xml:space="preserve"> </w:t>
-      </w:r>
-      <w:r>
-        <w:t xml:space="preserve">right answer, the conversation is about what the work shows and how to strengthen it moving forward. The</w:t>
-      </w:r>
-      <w:r>
-        <w:t xml:space="preserve"> </w:t>
-      </w:r>
-      <w:r>
-        <w:t xml:space="preserve">final letter grade isn't handed down unilaterally — you make an evidence-based case for it in your final</w:t>
-      </w:r>
-      <w:r>
-        <w:t xml:space="preserve"> </w:t>
-      </w:r>
-      <w:r>
-        <w:t xml:space="preserve">self-evaluation (Reflection 3), and I confirm or adjust. For the University's formal grade-appeal</w:t>
-      </w:r>
-      <w:r>
-        <w:t xml:space="preserve"> </w:t>
-      </w:r>
-      <w:r>
-        <w:t xml:space="preserve">procedure, see the</w:t>
-      </w:r>
-      <w:r>
-        <w:t xml:space="preserve"> </w:t>
-      </w:r>
-      <w:r>
-        <w:rPr>
-          <w:b/>
-          <w:bCs/>
-        </w:rPr>
-        <w:t xml:space="preserve">Student Resources &amp; Policy Information</w:t>
+        <w:t xml:space="preserve">and we'll talk it through; since each piece is evaluated on engagement and</w:t>
+      </w:r>
+      <w:r>
+        <w:t xml:space="preserve"> </w:t>
+      </w:r>
+      <w:r>
+        <w:t xml:space="preserve">reflection rather than a right answer, that conversation is about what the work shows and how to</w:t>
+      </w:r>
+      <w:r>
+        <w:t xml:space="preserve"> </w:t>
+      </w:r>
+      <w:r>
+        <w:t xml:space="preserve">strengthen it. For the University's formal grade-appeal procedure, see the</w:t>
+      </w:r>
+      <w:r>
+        <w:t xml:space="preserve"> </w:t>
+      </w:r>
+      <w:r>
+        <w:rPr>
+          <w:b/>
+          <w:bCs/>
+        </w:rPr>
+        <w:t xml:space="preserve">Student Resources &amp; Policy</w:t>
+      </w:r>
+      <w:r>
+        <w:rPr>
+          <w:b/>
+          <w:bCs/>
+        </w:rPr>
+        <w:t xml:space="preserve"> </w:t>
+      </w:r>
+      <w:r>
+        <w:rPr>
+          <w:b/>
+          <w:bCs/>
+        </w:rPr>
+        <w:t xml:space="preserve">Information</w:t>
       </w:r>
       <w:r>
         <w:t xml:space="preserve"> </w:t>
@@ -6597,7 +6730,34 @@
           <w:b/>
           <w:bCs/>
         </w:rPr>
-        <w:t xml:space="preserve">writing itself must be yours.</w:t>
+        <w:t xml:space="preserve">writing itself must be yours</w:t>
+      </w:r>
+      <w:r>
+        <w:t xml:space="preserve">, and note it at the end of the piece, e.g.</w:t>
+      </w:r>
+      <w:r>
+        <w:t xml:space="preserve"> </w:t>
+      </w:r>
+      <w:r>
+        <w:rPr>
+          <w:i/>
+          <w:iCs/>
+        </w:rPr>
+        <w:t xml:space="preserve">AI feedback: asked Claude</w:t>
+      </w:r>
+      <w:r>
+        <w:rPr>
+          <w:i/>
+          <w:iCs/>
+        </w:rPr>
+        <w:t xml:space="preserve"> </w:t>
+      </w:r>
+      <w:r>
+        <w:rPr>
+          <w:i/>
+          <w:iCs/>
+        </w:rPr>
+        <w:t xml:space="preserve">whether my argument was clear; I reorganized my second paragraph.</w:t>
       </w:r>
       <w:r>
         <w:t xml:space="preserve"> </w:t>

</xml_diff>

<commit_message>
Syllabus: soften remaining commitments made on the instructor's behalf
- Missed sessions: students catch up on their own (notebooks on the
  course site) instead of a promised individual catch-up
- Skills map: drop "nothing is assessed before it's taught"
- Late Work: extensions "can usually" be agreed, not guaranteed
- Response time: 24 hours weekdays, 48 hours weekends
- Remove the D4-may-be-dropped note (instructor-only)
- Technology: students flag tech problems so we can plan make-up work
- Class rhythm: describe the three kinds of work without fixed minutes
- Mirror all changes in the Fall 2026 .docx

Co-Authored-By: Claude Opus 5.5 <noreply@anthropic.com>
</commit_message>
<xml_diff>
--- a/WRIT20833_Fall_2026_Syllabus.docx
+++ b/WRIT20833_Fall_2026_Syllabus.docx
@@ -1172,7 +1172,7 @@
               <w:rPr>
                 <w:sz w:val="20"/>
               </w:rPr>
-              <w:t xml:space="preserve">Within 24 hours on weekdays (longer on weekends and holidays)</w:t>
+              <w:t xml:space="preserve">Within 24 hours on weekdays; within 48 hours on weekends (longer over holidays)</w:t>
             </w:r>
           </w:p>
         </w:tc>
@@ -2212,7 +2212,7 @@
         <w:pStyle w:val="FirstParagraph"/>
       </w:pPr>
       <w:r>
-        <w:t xml:space="preserve">Each 2-hour in-class session follows the same rhythm:</w:t>
+        <w:t xml:space="preserve">Most class sessions combine three kinds of work:</w:t>
       </w:r>
     </w:p>
     <w:p>
@@ -2228,7 +2228,7 @@
           <w:b/>
           <w:bCs/>
         </w:rPr>
-        <w:t xml:space="preserve">~25 min — concept / mini-lecture:</w:t>
+        <w:t xml:space="preserve">Concept / mini-lecture:</w:t>
       </w:r>
       <w:r>
         <w:t xml:space="preserve"> </w:t>
@@ -2250,7 +2250,7 @@
           <w:b/>
           <w:bCs/>
         </w:rPr>
-        <w:t xml:space="preserve">~70 min — live code-along:</w:t>
+        <w:t xml:space="preserve">Live code-along:</w:t>
       </w:r>
       <w:r>
         <w:t xml:space="preserve"> </w:t>
@@ -2272,7 +2272,7 @@
           <w:b/>
           <w:bCs/>
         </w:rPr>
-        <w:t xml:space="preserve">~25 min — application + share:</w:t>
+        <w:t xml:space="preserve">Application + share:</w:t>
       </w:r>
       <w:r>
         <w:t xml:space="preserve"> </w:t>
@@ -4273,30 +4273,6 @@
       <w:r>
         <w:t xml:space="preserve">rewrite a classmate's public sentence so it is honest about what their method flattened.</w:t>
       </w:r>
-      <w:r>
-        <w:t xml:space="preserve"> </w:t>
-      </w:r>
-      <w:r>
-        <w:rPr>
-          <w:i/>
-          <w:iCs/>
-        </w:rPr>
-        <w:t xml:space="preserve">(The course is designed for 4 discussions; D4 may be dropped to a 3-discussion minimum if</w:t>
-      </w:r>
-      <w:r>
-        <w:rPr>
-          <w:i/>
-          <w:iCs/>
-        </w:rPr>
-        <w:t xml:space="preserve"> </w:t>
-      </w:r>
-      <w:r>
-        <w:rPr>
-          <w:i/>
-          <w:iCs/>
-        </w:rPr>
-        <w:t xml:space="preserve">end-of-term capstone load is heavy.)</w:t>
-      </w:r>
     </w:p>
     <w:bookmarkEnd w:id="24"/>
     <w:bookmarkStart w:id="25" w:name="grading-philosophy-ungrading"/>
@@ -4731,7 +4707,7 @@
         <w:t xml:space="preserve">flexible if you contact me before the due date</w:t>
       </w:r>
       <w:r>
-        <w:t xml:space="preserve">; we'll agree on a new date. Work that's late without</w:t>
+        <w:t xml:space="preserve">, and we can usually agree on a new date. Work that's late without</w:t>
       </w:r>
       <w:r>
         <w:t xml:space="preserve"> </w:t>
@@ -4952,7 +4928,13 @@
         <w:t xml:space="preserve"> </w:t>
       </w:r>
       <w:r>
-        <w:t xml:space="preserve">and reflections. If you must miss a session, let me know in advance and we'll arrange a catch-up.</w:t>
+        <w:t xml:space="preserve">and reflections. If you must miss a session, let me know in advance; you're responsible for catching up</w:t>
+      </w:r>
+      <w:r>
+        <w:t xml:space="preserve"> </w:t>
+      </w:r>
+      <w:r>
+        <w:t xml:space="preserve">on what you missed (each day's notebook is on the course site).</w:t>
       </w:r>
     </w:p>
     <w:p>
@@ -7003,13 +6985,19 @@
         <w:t xml:space="preserve"> </w:t>
       </w:r>
       <w:r>
-        <w:t xml:space="preserve">there's nothing to install. If your device fails in class, let me know and pair with a classmate; you</w:t>
-      </w:r>
-      <w:r>
-        <w:t xml:space="preserve"> </w:t>
-      </w:r>
-      <w:r>
-        <w:t xml:space="preserve">can also reach me on TCU Online to catch up on anything you miss.</w:t>
+        <w:t xml:space="preserve">there's nothing to install. If your device fails in class, pair with a classmate for the session. If</w:t>
+      </w:r>
+      <w:r>
+        <w:t xml:space="preserve"> </w:t>
+      </w:r>
+      <w:r>
+        <w:t xml:space="preserve">you're having technology problems that affect your work, let me know so we can make a plan for making</w:t>
+      </w:r>
+      <w:r>
+        <w:t xml:space="preserve"> </w:t>
+      </w:r>
+      <w:r>
+        <w:t xml:space="preserve">up anything you've missed.</w:t>
       </w:r>
     </w:p>
     <w:p>
@@ -7319,21 +7307,7 @@
           <w:i/>
           <w:iCs/>
         </w:rPr>
-        <w:t xml:space="preserve">Each skill is introduced in a class code-along, then practiced in the linked homework. Nothing is</w:t>
-      </w:r>
-      <w:r>
-        <w:rPr>
-          <w:i/>
-          <w:iCs/>
-        </w:rPr>
-        <w:t xml:space="preserve"> </w:t>
-      </w:r>
-      <w:r>
-        <w:rPr>
-          <w:i/>
-          <w:iCs/>
-        </w:rPr>
-        <w:t xml:space="preserve">assessed before it's taught.</w:t>
+        <w:t xml:space="preserve">Each skill is introduced in a class code-along before the homework that uses it.</w:t>
       </w:r>
     </w:p>
     <w:tbl>

</xml_diff>